<commit_message>
simplify fill_header using add_text_paragraph
</commit_message>
<xml_diff>
--- a/实验六_面向对象软件案例的UML建模.docx
+++ b/实验六_面向对象软件案例的UML建模.docx
@@ -133,6 +133,7 @@
           <w:p>
             <w:pPr>
               <w:jc w:val="center"/>
+              <w:spacing w:line="400" w:lineRule="exact"/>
             </w:pPr>
             <w:r>
               <w:rPr>
@@ -155,6 +156,7 @@
           <w:p>
             <w:pPr>
               <w:jc w:val="center"/>
+              <w:spacing w:line="400" w:lineRule="exact"/>
             </w:pPr>
             <w:r>
               <w:rPr>
@@ -261,6 +263,7 @@
           <w:p>
             <w:pPr>
               <w:jc w:val="center"/>
+              <w:spacing w:line="400" w:lineRule="exact"/>
             </w:pPr>
             <w:r>
               <w:rPr>
@@ -283,6 +286,7 @@
           <w:p>
             <w:pPr>
               <w:jc w:val="center"/>
+              <w:spacing w:line="400" w:lineRule="exact"/>
             </w:pPr>
             <w:r>
               <w:rPr>
@@ -375,6 +379,7 @@
           <w:p>
             <w:pPr>
               <w:jc w:val="center"/>
+              <w:spacing w:line="400" w:lineRule="exact"/>
             </w:pPr>
             <w:r>
               <w:rPr>
@@ -397,6 +402,7 @@
           <w:p>
             <w:pPr>
               <w:jc w:val="center"/>
+              <w:spacing w:line="400" w:lineRule="exact"/>
             </w:pPr>
             <w:r>
               <w:rPr>
@@ -489,6 +495,7 @@
           <w:p>
             <w:pPr>
               <w:jc w:val="center"/>
+              <w:spacing w:line="400" w:lineRule="exact"/>
             </w:pPr>
             <w:r>
               <w:rPr>

</xml_diff>

<commit_message>
fix: correct right-side cell indices based on gridSpan (cells[7]/[7]/[6] for name/class/type)
</commit_message>
<xml_diff>
--- a/实验六_面向对象软件案例的UML建模.docx
+++ b/实验六_面向对象软件案例的UML建模.docx
@@ -155,16 +155,31 @@
           </w:tcPr>
           <w:p>
             <w:pPr>
-              <w:jc w:val="center"/>
-              <w:spacing w:line="400" w:lineRule="exact"/>
-            </w:pPr>
-            <w:r>
-              <w:rPr>
-                <w:b w:val="0"/>
-                <w:sz w:val="24"/>
-                <w:rFonts w:eastAsia="宋体" w:ascii="Times New Roman" w:hAnsi="Times New Roman"/>
-              </w:rPr>
-              <w:t>韩志鑫</w:t>
+              <w:rPr>
+                <w:rFonts w:hint="eastAsia" w:ascii="黑体" w:hAnsi="黑体" w:eastAsia="黑体"/>
+                <w:sz w:val="24"/>
+              </w:rPr>
+            </w:pPr>
+            <w:r>
+              <w:rPr>
+                <w:rFonts w:hint="eastAsia" w:ascii="黑体" w:hAnsi="黑体" w:eastAsia="黑体"/>
+                <w:sz w:val="24"/>
+              </w:rPr>
+              <w:t xml:space="preserve">姓 </w:t>
+            </w:r>
+            <w:r>
+              <w:rPr>
+                <w:rFonts w:ascii="黑体" w:hAnsi="黑体" w:eastAsia="黑体"/>
+                <w:sz w:val="24"/>
+              </w:rPr>
+              <w:t xml:space="preserve">   </w:t>
+            </w:r>
+            <w:r>
+              <w:rPr>
+                <w:rFonts w:hint="eastAsia" w:ascii="黑体" w:hAnsi="黑体" w:eastAsia="黑体"/>
+                <w:sz w:val="24"/>
+              </w:rPr>
+              <w:t>名</w:t>
             </w:r>
           </w:p>
         </w:tc>
@@ -179,18 +194,15 @@
           <w:p>
             <w:pPr>
               <w:jc w:val="center"/>
-              <w:rPr>
-                <w:rFonts w:hint="eastAsia"/>
-                <w:sz w:val="24"/>
-              </w:rPr>
-            </w:pPr>
-            <w:r>
-              <w:rPr>
-                <w:rFonts w:hint="eastAsia"/>
-                <w:color w:val="FF0000"/>
-                <w:sz w:val="24"/>
-              </w:rPr>
-              <w:t>（宋体，小四号，居中）</w:t>
+              <w:spacing w:line="400" w:lineRule="exact"/>
+            </w:pPr>
+            <w:r>
+              <w:rPr>
+                <w:b w:val="0"/>
+                <w:sz w:val="24"/>
+                <w:rFonts w:eastAsia="宋体" w:ascii="Times New Roman" w:hAnsi="Times New Roman"/>
+              </w:rPr>
+              <w:t>韩志鑫</w:t>
             </w:r>
           </w:p>
         </w:tc>
@@ -285,16 +297,31 @@
           </w:tcPr>
           <w:p>
             <w:pPr>
-              <w:jc w:val="center"/>
-              <w:spacing w:line="400" w:lineRule="exact"/>
-            </w:pPr>
-            <w:r>
-              <w:rPr>
-                <w:b w:val="0"/>
-                <w:sz w:val="24"/>
-                <w:rFonts w:eastAsia="宋体" w:ascii="Times New Roman" w:hAnsi="Times New Roman"/>
-              </w:rPr>
-              <w:t>23级卓越班</w:t>
+              <w:rPr>
+                <w:rFonts w:hint="eastAsia" w:ascii="黑体" w:hAnsi="黑体" w:eastAsia="黑体"/>
+                <w:sz w:val="24"/>
+              </w:rPr>
+            </w:pPr>
+            <w:r>
+              <w:rPr>
+                <w:rFonts w:hint="eastAsia" w:ascii="黑体" w:hAnsi="黑体" w:eastAsia="黑体"/>
+                <w:sz w:val="24"/>
+              </w:rPr>
+              <w:t xml:space="preserve">班 </w:t>
+            </w:r>
+            <w:r>
+              <w:rPr>
+                <w:rFonts w:ascii="黑体" w:hAnsi="黑体" w:eastAsia="黑体"/>
+                <w:sz w:val="24"/>
+              </w:rPr>
+              <w:t xml:space="preserve">   </w:t>
+            </w:r>
+            <w:r>
+              <w:rPr>
+                <w:rFonts w:hint="eastAsia" w:ascii="黑体" w:hAnsi="黑体" w:eastAsia="黑体"/>
+                <w:sz w:val="24"/>
+              </w:rPr>
+              <w:t>级</w:t>
             </w:r>
           </w:p>
         </w:tc>
@@ -309,18 +336,15 @@
           <w:p>
             <w:pPr>
               <w:jc w:val="center"/>
-              <w:rPr>
-                <w:rFonts w:hint="eastAsia"/>
-                <w:sz w:val="24"/>
-              </w:rPr>
-            </w:pPr>
-            <w:r>
-              <w:rPr>
-                <w:rFonts w:hint="eastAsia"/>
-                <w:color w:val="FF0000"/>
-                <w:sz w:val="24"/>
-              </w:rPr>
-              <w:t>（宋体，小四号，居中）</w:t>
+              <w:spacing w:line="400" w:lineRule="exact"/>
+            </w:pPr>
+            <w:r>
+              <w:rPr>
+                <w:b w:val="0"/>
+                <w:sz w:val="24"/>
+                <w:rFonts w:eastAsia="宋体" w:ascii="Times New Roman" w:hAnsi="Times New Roman"/>
+              </w:rPr>
+              <w:t>23级卓越班</w:t>
             </w:r>
           </w:p>
         </w:tc>
@@ -401,16 +425,17 @@
           </w:tcPr>
           <w:p>
             <w:pPr>
-              <w:jc w:val="center"/>
-              <w:spacing w:line="400" w:lineRule="exact"/>
-            </w:pPr>
-            <w:r>
-              <w:rPr>
-                <w:b w:val="0"/>
-                <w:sz w:val="24"/>
-                <w:rFonts w:eastAsia="宋体" w:ascii="Times New Roman" w:hAnsi="Times New Roman"/>
-              </w:rPr>
-              <w:t>必修课</w:t>
+              <w:rPr>
+                <w:rFonts w:hint="eastAsia" w:ascii="黑体" w:hAnsi="黑体" w:eastAsia="黑体"/>
+                <w:sz w:val="24"/>
+              </w:rPr>
+            </w:pPr>
+            <w:r>
+              <w:rPr>
+                <w:rFonts w:hint="eastAsia" w:ascii="黑体" w:hAnsi="黑体" w:eastAsia="黑体"/>
+                <w:sz w:val="24"/>
+              </w:rPr>
+              <w:t>课程类型</w:t>
             </w:r>
           </w:p>
         </w:tc>
@@ -425,18 +450,15 @@
           <w:p>
             <w:pPr>
               <w:jc w:val="center"/>
-              <w:rPr>
-                <w:rFonts w:hint="eastAsia" w:ascii="黑体" w:hAnsi="黑体" w:eastAsia="黑体"/>
-                <w:sz w:val="24"/>
-              </w:rPr>
-            </w:pPr>
-            <w:r>
-              <w:rPr>
-                <w:rFonts w:hint="eastAsia"/>
-                <w:color w:val="FF0000"/>
-                <w:sz w:val="24"/>
-              </w:rPr>
-              <w:t>（宋体，小四号，居中）</w:t>
+              <w:spacing w:line="400" w:lineRule="exact"/>
+            </w:pPr>
+            <w:r>
+              <w:rPr>
+                <w:b w:val="0"/>
+                <w:sz w:val="24"/>
+                <w:rFonts w:eastAsia="宋体" w:ascii="Times New Roman" w:hAnsi="Times New Roman"/>
+              </w:rPr>
+              <w:t>必修课</w:t>
             </w:r>
           </w:p>
         </w:tc>

</xml_diff>

<commit_message>
adjust workload split: 60% 韩志鑫, 40% 肖辉京
</commit_message>
<xml_diff>
--- a/实验六_面向对象软件案例的UML建模.docx
+++ b/实验六_面向对象软件案例的UML建模.docx
@@ -2968,7 +2968,7 @@
                       <w:sz w:val="24"/>
                       <w:rFonts w:eastAsia="宋体" w:ascii="Times New Roman" w:hAnsi="Times New Roman"/>
                     </w:rPr>
-                    <w:t>韩志鑫</w:t>
+                    <w:t>肖辉京</w:t>
                   </w:r>
                 </w:p>
               </w:tc>
@@ -3090,7 +3090,7 @@
                       <w:sz w:val="24"/>
                       <w:rFonts w:eastAsia="宋体" w:ascii="Times New Roman" w:hAnsi="Times New Roman"/>
                     </w:rPr>
-                    <w:t>韩志鑫</w:t>
+                    <w:t>肖辉京</w:t>
                   </w:r>
                 </w:p>
               </w:tc>
@@ -3456,7 +3456,7 @@
                       <w:sz w:val="24"/>
                       <w:rFonts w:eastAsia="宋体" w:ascii="Times New Roman" w:hAnsi="Times New Roman"/>
                     </w:rPr>
-                    <w:t>韩志鑫</w:t>
+                    <w:t>肖辉京</w:t>
                   </w:r>
                 </w:p>
               </w:tc>
@@ -4066,7 +4066,7 @@
                       <w:sz w:val="24"/>
                       <w:rFonts w:eastAsia="宋体" w:ascii="Times New Roman" w:hAnsi="Times New Roman"/>
                     </w:rPr>
-                    <w:t>韩志鑫</w:t>
+                    <w:t>肖辉京</w:t>
                   </w:r>
                 </w:p>
               </w:tc>
@@ -4432,7 +4432,7 @@
                       <w:sz w:val="24"/>
                       <w:rFonts w:eastAsia="宋体" w:ascii="Times New Roman" w:hAnsi="Times New Roman"/>
                     </w:rPr>
-                    <w:t>韩志鑫</w:t>
+                    <w:t>肖辉京</w:t>
                   </w:r>
                 </w:p>
               </w:tc>
@@ -4676,7 +4676,7 @@
                       <w:sz w:val="24"/>
                       <w:rFonts w:eastAsia="宋体" w:ascii="Times New Roman" w:hAnsi="Times New Roman"/>
                     </w:rPr>
-                    <w:t>韩志鑫</w:t>
+                    <w:t>肖辉京</w:t>
                   </w:r>
                 </w:p>
               </w:tc>
@@ -4798,7 +4798,7 @@
                       <w:sz w:val="24"/>
                       <w:rFonts w:eastAsia="宋体" w:ascii="Times New Roman" w:hAnsi="Times New Roman"/>
                     </w:rPr>
-                    <w:t>韩志鑫</w:t>
+                    <w:t>肖辉京</w:t>
                   </w:r>
                 </w:p>
               </w:tc>
@@ -4944,7 +4944,7 @@
                 <w:sz w:val="24"/>
                 <w:rFonts w:eastAsia="宋体" w:ascii="Times New Roman" w:hAnsi="Times New Roman"/>
               </w:rPr>
-              <w:t>合计预估耗时：315分钟；合计实际耗时：315分钟。小组成员分工：韩志鑫承担约90%的任务量，肖辉京承担约10%的任务量。</w:t>
+              <w:t>合计预估耗时：315分钟；合计实际耗时：315分钟。小组成员分工：韩志鑫承担约60%的任务量，肖辉京承担约40%的任务量。</w:t>
             </w:r>
           </w:p>
         </w:tc>
@@ -5045,7 +5045,7 @@
                 <w:sz w:val="24"/>
                 <w:rFonts w:eastAsia="宋体" w:ascii="Times New Roman" w:hAnsi="Times New Roman"/>
               </w:rPr>
-              <w:t>在本次实验中，我（韩志鑫）承担了约90%的任务量，主要负责以下工作：</w:t>
+              <w:t>在本次实验中，我（韩志鑫）承担了约60%的任务量，主要负责以下工作：</w:t>
             </w:r>
           </w:p>
           <w:p>

</xml_diff>

<commit_message>
redistribute task ownership more evenly
</commit_message>
<xml_diff>
--- a/实验六_面向对象软件案例的UML建模.docx
+++ b/实验六_面向对象软件案例的UML建模.docx
@@ -1561,7 +1561,7 @@
                 <w:sz w:val="24"/>
                 <w:rFonts w:eastAsia="黑体" w:ascii="Times New Roman" w:hAnsi="Times New Roman"/>
               </w:rPr>
-              <w:t>1.3 编写实体类与数据库工具类（完成人：韩志鑫）</w:t>
+              <w:t>1.3 编写实体类与数据库工具类（完成人：肖辉京）</w:t>
             </w:r>
           </w:p>
           <w:p>
@@ -1634,7 +1634,7 @@
                 <w:sz w:val="24"/>
                 <w:rFonts w:eastAsia="黑体" w:ascii="Times New Roman" w:hAnsi="Times New Roman"/>
               </w:rPr>
-              <w:t>1.5 编写JSP视图层（完成人：韩志鑫）</w:t>
+              <w:t>1.5 编写JSP视图层（完成人：肖辉京）</w:t>
             </w:r>
           </w:p>
           <w:p>
@@ -2092,7 +2092,7 @@
                 <w:sz w:val="24"/>
                 <w:rFonts w:eastAsia="黑体" w:ascii="Times New Roman" w:hAnsi="Times New Roman"/>
               </w:rPr>
-              <w:t>4.1 类图绘制（完成人：韩志鑫）</w:t>
+              <w:t>4.1 类图绘制（完成人：肖辉京）</w:t>
             </w:r>
           </w:p>
           <w:p>
@@ -2189,7 +2189,7 @@
                 <w:sz w:val="24"/>
                 <w:rFonts w:eastAsia="黑体" w:ascii="Times New Roman" w:hAnsi="Times New Roman"/>
               </w:rPr>
-              <w:t>5.1 用例图绘制（完成人：韩志鑫）</w:t>
+              <w:t>5.1 用例图绘制（完成人：肖辉京）</w:t>
             </w:r>
           </w:p>
           <w:p>

</xml_diff>